<commit_message>
Add Laravel + React conversion plan and CLAUDE.md
- docs/LARAVEL_REACT_PLAN.md: architecture (Laravel API + Sanctum + React SPA),
  folder structure, API contract, page map, build phases with acceptance
  criteria, coding conventions, enhancements, presentation plan
- CLAUDE.md: project context loaded by Claude Code
- Mark Blade/Livewire stack notes in SYSTEM_DOCUMENTATION as superseded

Co-Authored-By: Claude Opus 5.5 <noreply@anthropic.com>
Claude-Session: https://claude.ai/code/session_01FzUmQFRULi7LUeKhUCmQUX
</commit_message>
<xml_diff>
--- a/docs/Luminest_System_Documentation.docx
+++ b/docs/Luminest_System_Documentation.docx
@@ -2,7 +2,7 @@
 <file path=word/document.xml><?xml version="1.0" encoding="utf-8"?>
 <w:document xmlns:w="http://schemas.openxmlformats.org/wordprocessingml/2006/main" xmlns:m="http://schemas.openxmlformats.org/officeDocument/2006/math" xmlns:r="http://schemas.openxmlformats.org/officeDocument/2006/relationships" xmlns:o="urn:schemas-microsoft-com:office:office" xmlns:v="urn:schemas-microsoft-com:vml" xmlns:w10="urn:schemas-microsoft-com:office:word" xmlns:a="http://schemas.openxmlformats.org/drawingml/2006/main" xmlns:pic="http://schemas.openxmlformats.org/drawingml/2006/picture" xmlns:wp="http://schemas.openxmlformats.org/drawingml/2006/wordprocessingDrawing">
   <w:body>
-    <w:bookmarkStart w:id="71" w:name="X791c0ed6f315a76713f7662dc0ce844d061669c"/>
+    <w:bookmarkStart w:id="72" w:name="X791c0ed6f315a76713f7662dc0ce844d061669c"/>
     <w:p>
       <w:pPr>
         <w:pStyle w:val="Heading1"/>
@@ -14223,7 +14223,7 @@
       </w:r>
     </w:p>
     <w:bookmarkEnd w:id="58"/>
-    <w:bookmarkStart w:id="69" w:name="X36e2198b6f444fd463383db3c57c968a66607f5"/>
+    <w:bookmarkStart w:id="70" w:name="X36e2198b6f444fd463383db3c57c968a66607f5"/>
     <w:p>
       <w:pPr>
         <w:pStyle w:val="Heading2"/>
@@ -14256,13 +14256,48 @@
         <w:t xml:space="preserve">in §4, not of the file structure.</w:t>
       </w:r>
     </w:p>
-    <w:bookmarkStart w:id="59" w:name="Xa7e6e94ab6e0d7a96f2adeed1d8df2bbc28a678"/>
+    <w:bookmarkStart w:id="60" w:name="Xa7e6e94ab6e0d7a96f2adeed1d8df2bbc28a678"/>
     <w:p>
       <w:pPr>
         <w:pStyle w:val="Heading3"/>
       </w:pPr>
       <w:r>
         <w:t xml:space="preserve">8.1 Stack</w:t>
+      </w:r>
+    </w:p>
+    <w:p>
+      <w:pPr>
+        <w:pStyle w:val="BlockText"/>
+      </w:pPr>
+      <w:r>
+        <w:rPr>
+          <w:bCs/>
+          <w:b/>
+        </w:rPr>
+        <w:t xml:space="preserve">Superseded:</w:t>
+      </w:r>
+      <w:r>
+        <w:t xml:space="preserve"> </w:t>
+      </w:r>
+      <w:r>
+        <w:t xml:space="preserve">the course requires Laravel API + React. See</w:t>
+      </w:r>
+      <w:r>
+        <w:t xml:space="preserve"> </w:t>
+      </w:r>
+      <w:hyperlink r:id="rId59">
+        <w:r>
+          <w:rPr>
+            <w:rStyle w:val="VerbatimChar"/>
+          </w:rPr>
+          <w:t xml:space="preserve">LARAVEL_REACT_PLAN.md</w:t>
+        </w:r>
+      </w:hyperlink>
+      <w:r>
+        <w:t xml:space="preserve"> </w:t>
+      </w:r>
+      <w:r>
+        <w:t xml:space="preserve">for the stack, routes and frontend. The schema, enums, policies, services and validation below still apply.</w:t>
       </w:r>
     </w:p>
     <w:p>
@@ -14348,8 +14383,8 @@
         <w:t xml:space="preserve">also works. Don’t go SPA unless there is a reason.</w:t>
       </w:r>
     </w:p>
-    <w:bookmarkEnd w:id="59"/>
-    <w:bookmarkStart w:id="60" w:name="X6c6af6eb7b7aee809550eff7927beaa3bb16c45"/>
+    <w:bookmarkEnd w:id="60"/>
+    <w:bookmarkStart w:id="61" w:name="X6c6af6eb7b7aee809550eff7927beaa3bb16c45"/>
     <w:p>
       <w:pPr>
         <w:pStyle w:val="Heading3"/>
@@ -18127,8 +18162,8 @@
         <w:t xml:space="preserve">in the enum and map during import.</w:t>
       </w:r>
     </w:p>
-    <w:bookmarkEnd w:id="60"/>
-    <w:bookmarkStart w:id="61" w:name="X85a242eccba2b494c7435dbc2549a66658c432d"/>
+    <w:bookmarkEnd w:id="61"/>
+    <w:bookmarkStart w:id="62" w:name="X85a242eccba2b494c7435dbc2549a66658c432d"/>
     <w:p>
       <w:pPr>
         <w:pStyle w:val="Heading3"/>
@@ -18714,8 +18749,8 @@
         <w:t xml:space="preserve">), so the rules in §4 live in one place.</w:t>
       </w:r>
     </w:p>
-    <w:bookmarkEnd w:id="61"/>
-    <w:bookmarkStart w:id="62" w:name="Xe2dbf01a2f4c49cf933e44715c7800a60e9d968"/>
+    <w:bookmarkEnd w:id="62"/>
+    <w:bookmarkStart w:id="63" w:name="Xe2dbf01a2f4c49cf933e44715c7800a60e9d968"/>
     <w:p>
       <w:pPr>
         <w:pStyle w:val="Heading3"/>
@@ -18854,8 +18889,8 @@
         <w:t xml:space="preserve">.</w:t>
       </w:r>
     </w:p>
-    <w:bookmarkEnd w:id="62"/>
-    <w:bookmarkStart w:id="63" w:name="X9e6e5f2d75728eb709537f2438edd9b5e241573"/>
+    <w:bookmarkEnd w:id="63"/>
+    <w:bookmarkStart w:id="64" w:name="X9e6e5f2d75728eb709537f2438edd9b5e241573"/>
     <w:p>
       <w:pPr>
         <w:pStyle w:val="Heading3"/>
@@ -19096,8 +19131,8 @@
         <w:t xml:space="preserve">(custom check in the login request).</w:t>
       </w:r>
     </w:p>
-    <w:bookmarkEnd w:id="63"/>
-    <w:bookmarkStart w:id="64" w:name="X05b495201a1bd3c64029b419847905b1d4c8538"/>
+    <w:bookmarkEnd w:id="64"/>
+    <w:bookmarkStart w:id="65" w:name="X05b495201a1bd3c64029b419847905b1d4c8538"/>
     <w:p>
       <w:pPr>
         <w:pStyle w:val="Heading3"/>
@@ -19592,8 +19627,8 @@
         <w:t xml:space="preserve">) if you want notifications later — the current system has none, and it is the most obvious missing feature (tenants and prospects must poll pages to see changes).</w:t>
       </w:r>
     </w:p>
-    <w:bookmarkEnd w:id="64"/>
-    <w:bookmarkStart w:id="65" w:name="X78eb42be2fe36c0ca24574a529c371c0b208f8e"/>
+    <w:bookmarkEnd w:id="65"/>
+    <w:bookmarkStart w:id="66" w:name="X78eb42be2fe36c0ca24574a529c371c0b208f8e"/>
     <w:p>
       <w:pPr>
         <w:pStyle w:val="Heading3"/>
@@ -19874,14 +19909,37 @@
         </w:tc>
       </w:tr>
     </w:tbl>
-    <w:bookmarkEnd w:id="65"/>
-    <w:bookmarkStart w:id="66" w:name="X31d0f62458cb3c926854a64f03a6dacff712806"/>
+    <w:bookmarkEnd w:id="66"/>
+    <w:bookmarkStart w:id="67" w:name="X31d0f62458cb3c926854a64f03a6dacff712806"/>
     <w:p>
       <w:pPr>
         <w:pStyle w:val="Heading3"/>
       </w:pPr>
       <w:r>
         <w:t xml:space="preserve">8.8 Controllers &amp; routes (sketch)</w:t>
+      </w:r>
+    </w:p>
+    <w:p>
+      <w:pPr>
+        <w:pStyle w:val="BlockText"/>
+      </w:pPr>
+      <w:r>
+        <w:t xml:space="preserve">Superseded by the API contract in</w:t>
+      </w:r>
+      <w:r>
+        <w:t xml:space="preserve"> </w:t>
+      </w:r>
+      <w:r>
+        <w:rPr>
+          <w:rStyle w:val="VerbatimChar"/>
+        </w:rPr>
+        <w:t xml:space="preserve">LARAVEL_REACT_PLAN.md</w:t>
+      </w:r>
+      <w:r>
+        <w:t xml:space="preserve"> </w:t>
+      </w:r>
+      <w:r>
+        <w:t xml:space="preserve">§5.</w:t>
       </w:r>
     </w:p>
     <w:p>
@@ -22586,8 +22644,8 @@
         <w:t xml:space="preserve">;</w:t>
       </w:r>
     </w:p>
-    <w:bookmarkEnd w:id="66"/>
-    <w:bookmarkStart w:id="67" w:name="Xc9613a38f1323986e2ce0fce83fc5f8ecc0d0a5"/>
+    <w:bookmarkEnd w:id="67"/>
+    <w:bookmarkStart w:id="68" w:name="Xc9613a38f1323986e2ce0fce83fc5f8ecc0d0a5"/>
     <w:p>
       <w:pPr>
         <w:pStyle w:val="Heading3"/>
@@ -22767,8 +22825,8 @@
         <w:t xml:space="preserve">+ webhook.</w:t>
       </w:r>
     </w:p>
-    <w:bookmarkEnd w:id="67"/>
-    <w:bookmarkStart w:id="68" w:name="X3091b477398aaf937ecc76e6e35b3f275a44cf9"/>
+    <w:bookmarkEnd w:id="68"/>
+    <w:bookmarkStart w:id="69" w:name="X3091b477398aaf937ecc76e6e35b3f275a44cf9"/>
     <w:p>
       <w:pPr>
         <w:pStyle w:val="Heading3"/>
@@ -22792,9 +22850,9 @@
         </w:pict>
       </w:r>
     </w:p>
-    <w:bookmarkEnd w:id="68"/>
     <w:bookmarkEnd w:id="69"/>
-    <w:bookmarkStart w:id="70" w:name="X794fa16df5d1b5833e7231671b60df5641db772"/>
+    <w:bookmarkEnd w:id="70"/>
+    <w:bookmarkStart w:id="71" w:name="X794fa16df5d1b5833e7231671b60df5641db772"/>
     <w:p>
       <w:pPr>
         <w:pStyle w:val="Heading2"/>
@@ -23347,8 +23405,8 @@
         <w:t xml:space="preserve">Verify counts per table and per status before and after import.</w:t>
       </w:r>
     </w:p>
-    <w:bookmarkEnd w:id="70"/>
     <w:bookmarkEnd w:id="71"/>
+    <w:bookmarkEnd w:id="72"/>
     <w:sectPr/>
   </w:body>
 </w:document>

</xml_diff>